<commit_message>
Add Sprite Studio, Lullaby, and Track Splitter; fix runbook nav bug
- Fix a duplicate-declaration bug in index.html that broke all navigation
  (Sprite Studio and Track Splitter both declared spTimer/spPoll/5 shared
  element IDs under the same "sp" prefix)
- Document Sprite Studio, Lullaby (Remix/Piano/Melody Match engines,
  per-track routing, ACE-Step polish), and Track Splitter across the
  README, SETUP_FOR_CLAUDE.md runbook, and all three Word docs
- Add screenshots for Sprite Studio, Lullaby, and Track Splitter
- Update disk/dependency figures (lullabykit's torchfcpe + shim, ~95GB total)

Co-Authored-By: Claude Sonnet 5 <noreply@anthropic.com>
</commit_message>
<xml_diff>
--- a/docs/Install_and_Troubleshooting.docx
+++ b/docs/Install_and_Troubleshooting.docx
@@ -16,7 +16,7 @@
           <w:i/>
           <w:sz w:val="20"/>
         </w:rPr>
-        <w:t>For end users · state as of 3 July 2026</w:t>
+        <w:t>For end users · state as of 22 July 2026</w:t>
       </w:r>
     </w:p>
     <w:p>
@@ -29,7 +29,7 @@
     </w:p>
     <w:p>
       <w:r>
-        <w:t>A private AI studio in your browser: chat (with an optional uncensored mode), image generation and editing, full song generation (ACE-Step 1.5 — style tags + lyrics in, finished track out), speech-to-text, text-to-speech in 54 voices, your own cloned voice (Voice Studio), a story/novel writer, and an audiobook maker that narrates your stories with natural pacing. Everything runs on your own GPU — no accounts, no API keys, no cost per use.</w:t>
+        <w:t>A private AI studio in your browser: chat (with an optional uncensored mode), image generation and editing, a 2D game sprite generator (one character image in → a full style-matched animation set with transparent backgrounds and ready-to-use sprite sheets), full song generation (ACE-Step 1.5 — style tags + lyrics in, finished track out), a Lullaby maker (any song in → a soft piano/instrumental lullaby out) and a Track Splitter (any song → its 6 separate instrument tracks), speech-to-text, text-to-speech in 54 voices, your own cloned voice (Voice Studio), a story/novel writer, and an audiobook maker that narrates your stories with natural pacing. Everything runs on your own GPU — no accounts, no API keys, no cost per use.</w:t>
       </w:r>
     </w:p>
     <w:p>
@@ -68,7 +68,7 @@
     </w:p>
     <w:p>
       <w:r>
-        <w:t>Phases in the runbook: (0) preflight checks → (1) winget installs: Miniconda, Ollama, FFmpeg, Git, optional Tailscale → (2) write the 22 embedded source files → (3) four conda envs (xtts, chatterbox, nemo-asr, kokoro) → (4) git-clone ComfyUI to %USERPROFILE%\comfyui-src + its venv → (5) download models: Ollama LLMs, FLUX.2 Klein, ACE-Step 1.5 (~20 GB), speech/voice models, koboldcpp + Cydonia, optional Zonos → (6) 'studioctl start' and smoke-test every tab → (7) optional Tailscale remote access.</w:t>
+        <w:t>Phases in the runbook: (0) preflight checks → (1) winget installs: Miniconda, Ollama, FFmpeg, Git, optional Tailscale → (2) write the 25 embedded source files → (3) four conda envs (xtts, chatterbox, nemo-asr, kokoro) → (4) git-clone ComfyUI to %USERPROFILE%\comfyui-src + its venv (incl. rembg for sprite transparency) → (5) download models: Ollama LLMs, FLUX.2 Klein, ACE-Step 1.5 (~20 GB), speech/voice models, koboldcpp + Cydonia, optional Zonos → (6) 'studioctl start', smoke-test every tab, and add the Desktop shortcut → (7) optional Tailscale remote access → (8) lullabykit: its own venv (torch + Demucs + basic-pitch) plus bundled FluidSynth and soundfonts, for the Lullaby and Track Splitter tabs.</w:t>
       </w:r>
     </w:p>
     <w:p>
@@ -92,6 +92,21 @@
     <w:p>
       <w:r>
         <w:t>Audiobook tips: generate or paste your text, pick a narrator (any Kokoro voice, Chatterbox, Zonos, or your own fine-tuned voice), Preview the voice, then Render — chapters appear as they finish, with natural pauses and even loudness across the whole book.</w:t>
+      </w:r>
+    </w:p>
+    <w:p>
+      <w:r>
+        <w:t>Sprite tips: give the Sprites tab ONE clean picture of your character (it defines the art style) and a short description of who they are — mention the outfit and its colors, plus any style words like 'paper cut-out'. Pick a single action or the full set, and expect ~30–40 s per frame (a full 36-frame set runs ~20 minutes; frames appear as they finish and you can cancel anytime — finished frames are kept). If one frame comes out wrong, hover it and press ↻ to re-roll just that frame; the old frame is kept in the set's _backups folder. Everything is saved under local-ai-studio\sprites\&lt;set name&gt;\ — grab the whole thing with 'Download set (.zip)'.</w:t>
+      </w:r>
+    </w:p>
+    <w:p>
+      <w:r>
+        <w:t>Lullaby tips: upload a song and press 'Analyze song' first — this separates it into 6 tracks and shows a waveform, so you can listen to and weight each stem before rendering. Remix (the default engine) sounds closest to the original; Piano rebuilds it as a completely different, storybook-style arrangement; Melody Match traces the actual sung tune onto a single instrument (cello by default) when you want the melody itself clearly recognizable rather than an AI reimagining or a quantized arrangement — pick just the vocals track for it if that's the line you want followed. In Melody Match, each ticked track has its own Route dropdown: leave it on 'Melody Match' for the line you want traced onto the instrument, or switch it to 'Piano arrangement' for a track you'd rather hear rebuilt as a full backing arrangement instead (e.g. vocals on cello, an existing piano part rebuilt) — both are mixed into one render, and an optional ACE-Step polish pass can run over the result afterward. If a Remix render still sounds a bit bright or busy, raise the Denoise slider slightly; for a sleepier feel on any engine, lower the tempo. Stop any loaded model first — Lullaby and Track Splitter need the whole GPU to themselves.</w:t>
+      </w:r>
+    </w:p>
+    <w:p>
+      <w:r>
+        <w:t>Track Splitter tips: use it any time you just want the raw stems (vocals, guitar, piano, bass, drums, everything else) with no lullaby-style rearranging — e.g. for a karaoke track or to sample an instrument. Splitting a song here first means opening the same song in the Lullaby tab reuses the separation instantly instead of reprocessing it.</w:t>
       </w:r>
     </w:p>
     <w:p>
@@ -319,6 +334,72 @@
           <w:p>
             <w:r>
               <w:t>Run 'studio stop' then 'studio start'</w:t>
+            </w:r>
+          </w:p>
+        </w:tc>
+      </w:tr>
+      <w:tr>
+        <w:tc>
+          <w:tcPr>
+            <w:tcW w:type="dxa" w:w="4320"/>
+          </w:tcPr>
+          <w:p>
+            <w:r>
+              <w:t>Lullaby / Track Splitter says 'stop the loaded model first'</w:t>
+            </w:r>
+          </w:p>
+        </w:tc>
+        <w:tc>
+          <w:tcPr>
+            <w:tcW w:type="dxa" w:w="4320"/>
+          </w:tcPr>
+          <w:p>
+            <w:r>
+              <w:t>Both need the whole GPU for Demucs — Stop whatever tab's model is loaded, then try again</w:t>
+            </w:r>
+          </w:p>
+        </w:tc>
+      </w:tr>
+      <w:tr>
+        <w:tc>
+          <w:tcPr>
+            <w:tcW w:type="dxa" w:w="4320"/>
+          </w:tcPr>
+          <w:p>
+            <w:r>
+              <w:t>Lullaby / Track Splitter says 'lullabykit is not installed'</w:t>
+            </w:r>
+          </w:p>
+        </w:tc>
+        <w:tc>
+          <w:tcPr>
+            <w:tcW w:type="dxa" w:w="4320"/>
+          </w:tcPr>
+          <w:p>
+            <w:r>
+              <w:t>PHASE 8 wasn't completed — its venv under local-ai-studio\lullabykit\.venv is missing; re-run that phase of the setup runbook</w:t>
+            </w:r>
+          </w:p>
+        </w:tc>
+      </w:tr>
+      <w:tr>
+        <w:tc>
+          <w:tcPr>
+            <w:tcW w:type="dxa" w:w="4320"/>
+          </w:tcPr>
+          <w:p>
+            <w:r>
+              <w:t>Lullaby Piano output wanders off-key with 'ACE-Step polish' on</w:t>
+            </w:r>
+          </w:p>
+        </w:tc>
+        <w:tc>
+          <w:tcPr>
+            <w:tcW w:type="dxa" w:w="4320"/>
+          </w:tcPr>
+          <w:p>
+            <w:r>
+              <w:t>Known limitation — turn the polish toggle off; it conditions poorly on the sparse solo-piano input</w:t>
             </w:r>
           </w:p>
         </w:tc>

</xml_diff>